<commit_message>
VAC charts and several minor changes
</commit_message>
<xml_diff>
--- a/airports/Published/Afghanistan/OAIX/OAIX.docx
+++ b/airports/Published/Afghanistan/OAIX/OAIX.docx
@@ -8,18 +8,18 @@
           <w:noProof/>
         </w:rPr>
         <w:drawing>
-          <wp:anchor distT="0" distB="0" distL="114300" distR="114300" simplePos="0" relativeHeight="251777536" behindDoc="0" locked="0" layoutInCell="1" allowOverlap="1" wp14:anchorId="4B09E6FA" wp14:editId="2309E63D">
+          <wp:anchor distT="0" distB="0" distL="114300" distR="114300" simplePos="0" relativeHeight="251777536" behindDoc="0" locked="0" layoutInCell="1" allowOverlap="1" wp14:anchorId="5BDB92EE" wp14:editId="641C663A">
             <wp:simplePos x="0" y="0"/>
             <wp:positionH relativeFrom="margin">
-              <wp:align>center</wp:align>
+              <wp:posOffset>2103120</wp:posOffset>
             </wp:positionH>
             <wp:positionV relativeFrom="paragraph">
-              <wp:posOffset>2104390</wp:posOffset>
+              <wp:posOffset>2095805</wp:posOffset>
             </wp:positionV>
-            <wp:extent cx="5106838" cy="7040236"/>
-            <wp:effectExtent l="0" t="0" r="0" b="8890"/>
+            <wp:extent cx="5193792" cy="7062192"/>
+            <wp:effectExtent l="0" t="0" r="6985" b="5715"/>
             <wp:wrapNone/>
-            <wp:docPr id="376191485" name="Picture 30"/>
+            <wp:docPr id="2134561407" name="Picture 18"/>
             <wp:cNvGraphicFramePr>
               <a:graphicFrameLocks xmlns:a="http://schemas.openxmlformats.org/drawingml/2006/main" noChangeAspect="1"/>
             </wp:cNvGraphicFramePr>
@@ -27,7 +27,7 @@
               <a:graphicData uri="http://schemas.openxmlformats.org/drawingml/2006/picture">
                 <pic:pic xmlns:pic="http://schemas.openxmlformats.org/drawingml/2006/picture">
                   <pic:nvPicPr>
-                    <pic:cNvPr id="376191485" name="Picture 376191485"/>
+                    <pic:cNvPr id="2134561407" name="Picture 2134561407"/>
                     <pic:cNvPicPr/>
                   </pic:nvPicPr>
                   <pic:blipFill rotWithShape="1">
@@ -38,7 +38,7 @@
                         </a:ext>
                       </a:extLst>
                     </a:blip>
-                    <a:srcRect l="11885" t="6226" r="13495" b="9469"/>
+                    <a:srcRect l="11449" t="7028" r="13540" b="9384"/>
                     <a:stretch>
                       <a:fillRect/>
                     </a:stretch>
@@ -46,7 +46,7 @@
                   <pic:spPr bwMode="auto">
                     <a:xfrm>
                       <a:off x="0" y="0"/>
-                      <a:ext cx="5106838" cy="7040236"/>
+                      <a:ext cx="5199530" cy="7069994"/>
                     </a:xfrm>
                     <a:prstGeom prst="rect">
                       <a:avLst/>
@@ -79,7 +79,7 @@
         <mc:AlternateContent>
           <mc:Choice Requires="wps">
             <w:drawing>
-              <wp:anchor distT="45720" distB="45720" distL="114300" distR="114300" simplePos="0" relativeHeight="251776512" behindDoc="0" locked="0" layoutInCell="1" allowOverlap="1" wp14:anchorId="5681FB18" wp14:editId="4EAE5937">
+              <wp:anchor distT="45720" distB="45720" distL="114300" distR="114300" simplePos="0" relativeHeight="251776512" behindDoc="0" locked="0" layoutInCell="1" allowOverlap="1" wp14:anchorId="5681FB18" wp14:editId="775F650B">
                 <wp:simplePos x="0" y="0"/>
                 <wp:positionH relativeFrom="column">
                   <wp:posOffset>6473406</wp:posOffset>
@@ -1270,7 +1270,7 @@
                                 <w:sz w:val="20"/>
                                 <w:szCs w:val="20"/>
                               </w:rPr>
-                              <w:t>0</w:t>
+                              <w:t>1</w:t>
                             </w:r>
                           </w:p>
                         </w:txbxContent>
@@ -1321,7 +1321,7 @@
                           <w:sz w:val="20"/>
                           <w:szCs w:val="20"/>
                         </w:rPr>
-                        <w:t>0</w:t>
+                        <w:t>1</w:t>
                       </w:r>
                     </w:p>
                   </w:txbxContent>

</xml_diff>